<commit_message>
Add music-industry background and paid media detail; retailor Infinite Music resume
Adds true, dated facts to the master profile (Head for the Hills touring
crew and Mishawaka Amphitheatre venue crew 2005-2009, Spotify for Artists
familiarity, Google/Meta/programmatic paid media experience) and reflects
them in the Infinite Music Head of Marketing resume, fit score, and match
report.
</commit_message>
<xml_diff>
--- a/applications/infinite-music-head-of-marketing/resume.docx
+++ b/applications/infinite-music-head-of-marketing/resume.docx
@@ -80,7 +80,7 @@
           <w:i w:val="0"/>
           <w:color w:val="1A1A1A"/>
         </w:rPr>
-        <w:t>Marketing leader with 15+ years owning the full marketing function in lean, fast-moving environments — comfortable as both strategist and executor, and fluent in building distinct messaging and journeys for B2C and B2B audiences. As founder of Solenzo, I run brand positioning, content and social strategy, demand generation, and CRM architecture end-to-end for a portfolio of clients, directing lead-generation funnels grounded in organic growth before layering in paid amplification and AI-driven automation to scale what's working. I bring the cross-functional range — sales enablement, vendor management, client-facing delivery, and a fast-adopting, tech-forward mindset — to lead a central marketing engine across a growing portfolio of businesses and new verticals.</w:t>
+        <w:t>Marketing leader with 15+ years owning the full marketing function in lean, fast-moving environments — comfortable as both strategist and executor, and fluent in building distinct messaging and journeys for B2C and B2B audiences. As founder of Solenzo, I run brand positioning, content and social strategy, demand generation, paid media (Google, Meta, programmatic), and CRM architecture end-to-end for a portfolio of clients, directing lead-generation funnels grounded in organic growth before layering in paid amplification and AI-driven automation to scale what's working. My roots in the music industry go back further than my career — years on the road as touring crew for a Fort Collins band and on the crew at a live venue — a genuine, ground-level starting point for leading marketing at a company built around independent artists. I bring the cross-functional range — sales enablement, vendor management, client-facing delivery, and a fast-adopting, tech-forward mindset — to lead a central marketing engine across a growing portfolio of businesses and new verticals.</w:t>
       </w:r>
     </w:p>
     <w:p>
@@ -225,6 +225,30 @@
           <w:i w:val="0"/>
           <w:color w:val="1A1A1A"/>
         </w:rPr>
+        <w:t>Manage paid media across Google Ads and Meta Ads for client accounts — campaign setup, budget management, and ongoing optimization — cutting spam/low-quality leads and improving click-through quality.</w:t>
+      </w:r>
+    </w:p>
+    <w:p>
+      <w:pPr>
+        <w:spacing w:after="30"/>
+        <w:ind w:left="259" w:hanging="259"/>
+      </w:pPr>
+      <w:r>
+        <w:rPr>
+          <w:rFonts w:ascii="Calibri" w:hAnsi="Calibri"/>
+          <w:b w:val="0"/>
+          <w:i w:val="0"/>
+          <w:color w:val="163A5F"/>
+        </w:rPr>
+        <w:t xml:space="preserve">•  </w:t>
+      </w:r>
+      <w:r>
+        <w:rPr>
+          <w:rFonts w:ascii="Calibri" w:hAnsi="Calibri"/>
+          <w:b w:val="0"/>
+          <w:i w:val="0"/>
+          <w:color w:val="1A1A1A"/>
+        </w:rPr>
         <w:t>Establish KPIs and manage the marketing tech stack (GoHighLevel, HubSpot, GA4), building executive-facing dashboards on lead generation, funnel progression, ROI, and pipeline velocity — connecting marketing activity directly to pipeline.</w:t>
       </w:r>
     </w:p>
@@ -298,30 +322,6 @@
           <w:color w:val="1A1A1A"/>
         </w:rPr>
         <w:t>Draft high-conversion sales assets — landing pages, direct-response copy, outreach sequences — equipping client sales teams to move prospects through the pipeline faster.</w:t>
-      </w:r>
-    </w:p>
-    <w:p>
-      <w:pPr>
-        <w:spacing w:after="30"/>
-        <w:ind w:left="259" w:hanging="259"/>
-      </w:pPr>
-      <w:r>
-        <w:rPr>
-          <w:rFonts w:ascii="Calibri" w:hAnsi="Calibri"/>
-          <w:b w:val="0"/>
-          <w:i w:val="0"/>
-          <w:color w:val="163A5F"/>
-        </w:rPr>
-        <w:t xml:space="preserve">•  </w:t>
-      </w:r>
-      <w:r>
-        <w:rPr>
-          <w:rFonts w:ascii="Calibri" w:hAnsi="Calibri"/>
-          <w:b w:val="0"/>
-          <w:i w:val="0"/>
-          <w:color w:val="1A1A1A"/>
-        </w:rPr>
-        <w:t>Serve as the primary strategic point of contact for a portfolio of clients — leading discovery, onboarding, and vendor/partner coordination, and aligning marketing programs with sales and technical teams on shared objectives.</w:t>
       </w:r>
     </w:p>
     <w:p>
@@ -400,6 +400,30 @@
           <w:color w:val="1A1A1A"/>
         </w:rPr>
         <w:t>Managed integrated multi-channel campaigns across inbound, paid media, and content, acting as strategic lead and coordinating execution across internal departments.</w:t>
+      </w:r>
+    </w:p>
+    <w:p>
+      <w:pPr>
+        <w:spacing w:after="30"/>
+        <w:ind w:left="259" w:hanging="259"/>
+      </w:pPr>
+      <w:r>
+        <w:rPr>
+          <w:rFonts w:ascii="Calibri" w:hAnsi="Calibri"/>
+          <w:b w:val="0"/>
+          <w:i w:val="0"/>
+          <w:color w:val="163A5F"/>
+        </w:rPr>
+        <w:t xml:space="preserve">•  </w:t>
+      </w:r>
+      <w:r>
+        <w:rPr>
+          <w:rFonts w:ascii="Calibri" w:hAnsi="Calibri"/>
+          <w:b w:val="0"/>
+          <w:i w:val="0"/>
+          <w:color w:val="1A1A1A"/>
+        </w:rPr>
+        <w:t>Sold and helped manage programmatic display/video ad placements alongside paid social and search as part of integrated client media plans.</w:t>
       </w:r>
     </w:p>
     <w:p>
@@ -554,30 +578,6 @@
     </w:p>
     <w:p>
       <w:pPr>
-        <w:spacing w:after="30"/>
-        <w:ind w:left="259" w:hanging="259"/>
-      </w:pPr>
-      <w:r>
-        <w:rPr>
-          <w:rFonts w:ascii="Calibri" w:hAnsi="Calibri"/>
-          <w:b w:val="0"/>
-          <w:i w:val="0"/>
-          <w:color w:val="163A5F"/>
-        </w:rPr>
-        <w:t xml:space="preserve">•  </w:t>
-      </w:r>
-      <w:r>
-        <w:rPr>
-          <w:rFonts w:ascii="Calibri" w:hAnsi="Calibri"/>
-          <w:b w:val="0"/>
-          <w:i w:val="0"/>
-          <w:color w:val="1A1A1A"/>
-        </w:rPr>
-        <w:t>Collaborated with Product and Engineering to translate structured partner feedback into roadmap input, working cross-functionally across technical and go-to-market teams.</w:t>
-      </w:r>
-    </w:p>
-    <w:p>
-      <w:pPr>
         <w:tabs>
           <w:tab w:pos="10512" w:val="right"/>
         </w:tabs>
@@ -652,6 +652,30 @@
           <w:color w:val="1A1A1A"/>
         </w:rPr>
         <w:t>Managed client accounts for a performance marketing agency, translating multi-channel campaign performance data into optimization recommendations across paid media and creative.</w:t>
+      </w:r>
+    </w:p>
+    <w:p>
+      <w:pPr>
+        <w:spacing w:after="30"/>
+        <w:ind w:left="259" w:hanging="259"/>
+      </w:pPr>
+      <w:r>
+        <w:rPr>
+          <w:rFonts w:ascii="Calibri" w:hAnsi="Calibri"/>
+          <w:b w:val="0"/>
+          <w:i w:val="0"/>
+          <w:color w:val="163A5F"/>
+        </w:rPr>
+        <w:t xml:space="preserve">•  </w:t>
+      </w:r>
+      <w:r>
+        <w:rPr>
+          <w:rFonts w:ascii="Calibri" w:hAnsi="Calibri"/>
+          <w:b w:val="0"/>
+          <w:i w:val="0"/>
+          <w:color w:val="1A1A1A"/>
+        </w:rPr>
+        <w:t>Sold programmatic display/video advertising campaigns to clients alongside search and social buys as part of full-funnel media engagements.</w:t>
       </w:r>
     </w:p>
     <w:p>
@@ -806,30 +830,6 @@
     </w:p>
     <w:p>
       <w:pPr>
-        <w:spacing w:after="30"/>
-        <w:ind w:left="259" w:hanging="259"/>
-      </w:pPr>
-      <w:r>
-        <w:rPr>
-          <w:rFonts w:ascii="Calibri" w:hAnsi="Calibri"/>
-          <w:b w:val="0"/>
-          <w:i w:val="0"/>
-          <w:color w:val="163A5F"/>
-        </w:rPr>
-        <w:t xml:space="preserve">•  </w:t>
-      </w:r>
-      <w:r>
-        <w:rPr>
-          <w:rFonts w:ascii="Calibri" w:hAnsi="Calibri"/>
-          <w:b w:val="0"/>
-          <w:i w:val="0"/>
-          <w:color w:val="1A1A1A"/>
-        </w:rPr>
-        <w:t>Led digital growth consultations aligning site architecture, inbound marketing, and SEO best practices to lift client traffic and conversion.</w:t>
-      </w:r>
-    </w:p>
-    <w:p>
-      <w:pPr>
         <w:tabs>
           <w:tab w:pos="10512" w:val="right"/>
         </w:tabs>
@@ -945,7 +945,7 @@
           <w:color w:val="1A1A1A"/>
           <w:sz w:val="21"/>
         </w:rPr>
-        <w:t>Account Executive</w:t>
+        <w:t>Roadie / Touring Crew &amp; Venue Crew</w:t>
       </w:r>
       <w:r>
         <w:rPr>
@@ -955,7 +955,7 @@
           <w:color w:val="163A5F"/>
           <w:sz w:val="21"/>
         </w:rPr>
-        <w:t xml:space="preserve">  |  Fivestars</w:t>
+        <w:t xml:space="preserve">  |  Head for the Hills (touring band) / Mishawaka Amphitheatre</w:t>
       </w:r>
       <w:r>
         <w:rPr>
@@ -966,7 +966,7 @@
           <w:sz w:val="18"/>
         </w:rPr>
         <w:tab/>
-        <w:t>2017 – 2018</w:t>
+        <w:t>2005 – 2009</w:t>
       </w:r>
     </w:p>
     <w:p>
@@ -981,7 +981,7 @@
           <w:color w:val="555555"/>
           <w:sz w:val="18"/>
         </w:rPr>
-        <w:t>Denver, CO</w:t>
+        <w:t>Fort Collins, CO</w:t>
       </w:r>
     </w:p>
     <w:p>
@@ -1005,7 +1005,7 @@
           <w:i w:val="0"/>
           <w:color w:val="1A1A1A"/>
         </w:rPr>
-        <w:t>Ran full-cycle sales for a loyalty and marketing-automation platform targeting SMBs — high-volume prospecting, lead qualification, and customer acquisition.</w:t>
+        <w:t>Worked touring crew for Head for the Hills, a Fort Collins bluegrass band, and venue crew at Mishawaka Amphitheatre — ground-level grounding in live music production, touring logistics, and how independent artists build and tour an audience, well before it became a career.</w:t>
       </w:r>
     </w:p>
     <w:p>
@@ -1140,6 +1140,29 @@
           <w:color w:val="1A1A1A"/>
         </w:rPr>
         <w:t>Agentic AI, Marketing Automation Architecture, LLM Workflows, Prompt Design, Rapid Prototyping</w:t>
+      </w:r>
+    </w:p>
+    <w:p>
+      <w:pPr>
+        <w:spacing w:after="30"/>
+      </w:pPr>
+      <w:r>
+        <w:rPr>
+          <w:rFonts w:ascii="Calibri" w:hAnsi="Calibri"/>
+          <w:b/>
+          <w:i w:val="0"/>
+          <w:color w:val="1A1A1A"/>
+        </w:rPr>
+        <w:t xml:space="preserve">Music Industry Grounding:  </w:t>
+      </w:r>
+      <w:r>
+        <w:rPr>
+          <w:rFonts w:ascii="Calibri" w:hAnsi="Calibri"/>
+          <w:b w:val="0"/>
+          <w:i w:val="0"/>
+          <w:color w:val="1A1A1A"/>
+        </w:rPr>
+        <w:t>Live Touring &amp; Venue Production, Independent Artist Ecosystem, Spotify for Artists Familiarity</w:t>
       </w:r>
     </w:p>
     <w:p>

</xml_diff>